<commit_message>
Fix reference formatting to match lecture materials
</commit_message>
<xml_diff>
--- a/26F1435_嘉永島大馳.docx
+++ b/26F1435_嘉永島大馳.docx
@@ -548,7 +548,7 @@
           <w:sz w:val="22"/>
           <w:szCs w:val="22"/>
         </w:rPr>
-        <w:t xml:space="preserve">2014　『贈与論 他二篇』森山工訳、岩波文庫。</w:t>
+        <w:t xml:space="preserve">2014　『贈与論 他二篇』、森山工訳、岩波文庫。</w:t>
       </w:r>
     </w:p>
     <w:p>
@@ -579,7 +579,7 @@
           <w:sz w:val="22"/>
           <w:szCs w:val="22"/>
         </w:rPr>
-        <w:t xml:space="preserve">2012　『石器時代の経済学』山内昶訳、法政大学出版局。</w:t>
+        <w:t xml:space="preserve">2012　『石器時代の経済学』山内 昶訳、法政大学出版局。</w:t>
       </w:r>
     </w:p>
     <w:p>

</xml_diff>